<commit_message>
Fix spooky banner filename casing
</commit_message>
<xml_diff>
--- a/Dos and win shell. Spooky commands..docx
+++ b/Dos and win shell. Spooky commands..docx
@@ -196,6 +196,24 @@
         </w:rPr>
         <w:t>] All services safely terminated.</w:t>
       </w:r>
+    </w:p>
+    <w:p>
+      <w:pPr>
+        <w:rPr>
+          <w:rFonts w:ascii="Comic Sans MS" w:hAnsi="Comic Sans MS"/>
+          <w:sz w:val="24"/>
+          <w:szCs w:val="24"/>
+        </w:rPr>
+      </w:pPr>
+    </w:p>
+    <w:p>
+      <w:pPr>
+        <w:rPr>
+          <w:rFonts w:ascii="Comic Sans MS" w:hAnsi="Comic Sans MS"/>
+          <w:sz w:val="24"/>
+          <w:szCs w:val="24"/>
+        </w:rPr>
+      </w:pPr>
     </w:p>
     <w:p>
       <w:pPr>
@@ -252,6 +270,302 @@
     </w:p>
     <w:p>
       <w:pPr>
+        <w:spacing w:after="0" w:line="240" w:lineRule="auto"/>
+        <w:rPr>
+          <w:color w:val="C00000"/>
+          <w:sz w:val="28"/>
+          <w:szCs w:val="28"/>
+        </w:rPr>
+      </w:pPr>
+      <w:r>
+        <w:rPr>
+          <w:color w:val="C00000"/>
+          <w:sz w:val="28"/>
+          <w:szCs w:val="28"/>
+        </w:rPr>
+        <w:t xml:space="preserve">git </w:t>
+      </w:r>
+      <w:proofErr w:type="gramStart"/>
+      <w:r>
+        <w:rPr>
+          <w:color w:val="C00000"/>
+          <w:sz w:val="28"/>
+          <w:szCs w:val="28"/>
+        </w:rPr>
+        <w:t>add .</w:t>
+      </w:r>
+      <w:proofErr w:type="gramEnd"/>
+    </w:p>
+    <w:p>
+      <w:pPr>
+        <w:spacing w:after="0" w:line="240" w:lineRule="auto"/>
+        <w:rPr>
+          <w:color w:val="C00000"/>
+          <w:sz w:val="28"/>
+          <w:szCs w:val="28"/>
+        </w:rPr>
+      </w:pPr>
+    </w:p>
+    <w:p>
+      <w:pPr>
+        <w:spacing w:after="0" w:line="240" w:lineRule="auto"/>
+        <w:rPr>
+          <w:color w:val="3A7C22" w:themeColor="accent6" w:themeShade="BF"/>
+          <w:sz w:val="28"/>
+          <w:szCs w:val="28"/>
+        </w:rPr>
+      </w:pPr>
+      <w:r>
+        <w:rPr>
+          <w:color w:val="3A7C22" w:themeColor="accent6" w:themeShade="BF"/>
+          <w:sz w:val="28"/>
+          <w:szCs w:val="28"/>
+        </w:rPr>
+        <w:t xml:space="preserve">This next command is specific to each </w:t>
+      </w:r>
+      <w:proofErr w:type="spellStart"/>
+      <w:r>
+        <w:rPr>
+          <w:color w:val="3A7C22" w:themeColor="accent6" w:themeShade="BF"/>
+          <w:sz w:val="28"/>
+          <w:szCs w:val="28"/>
+        </w:rPr>
+        <w:t>each</w:t>
+      </w:r>
+      <w:proofErr w:type="spellEnd"/>
+      <w:r>
+        <w:rPr>
+          <w:color w:val="3A7C22" w:themeColor="accent6" w:themeShade="BF"/>
+          <w:sz w:val="28"/>
+          <w:szCs w:val="28"/>
+        </w:rPr>
+        <w:t xml:space="preserve"> use. </w:t>
+      </w:r>
+    </w:p>
+    <w:p>
+      <w:pPr>
+        <w:spacing w:after="0" w:line="240" w:lineRule="auto"/>
+        <w:rPr>
+          <w:color w:val="3A7C22" w:themeColor="accent6" w:themeShade="BF"/>
+          <w:sz w:val="28"/>
+          <w:szCs w:val="28"/>
+        </w:rPr>
+      </w:pPr>
+    </w:p>
+    <w:p>
+      <w:pPr>
+        <w:spacing w:after="0" w:line="240" w:lineRule="auto"/>
+        <w:rPr>
+          <w:color w:val="3A7C22" w:themeColor="accent6" w:themeShade="BF"/>
+          <w:sz w:val="28"/>
+          <w:szCs w:val="28"/>
+        </w:rPr>
+      </w:pPr>
+      <w:r>
+        <w:rPr>
+          <w:color w:val="3A7C22" w:themeColor="accent6" w:themeShade="BF"/>
+          <w:sz w:val="28"/>
+          <w:szCs w:val="28"/>
+        </w:rPr>
+        <w:t xml:space="preserve">Everything between the quotation marks in git commit -m "..." is simply your </w:t>
+      </w:r>
+      <w:r>
+        <w:rPr>
+          <w:b/>
+          <w:bCs/>
+          <w:color w:val="3A7C22" w:themeColor="accent6" w:themeShade="BF"/>
+          <w:sz w:val="28"/>
+          <w:szCs w:val="28"/>
+        </w:rPr>
+        <w:t>log message</w:t>
+      </w:r>
+      <w:r>
+        <w:rPr>
+          <w:color w:val="3A7C22" w:themeColor="accent6" w:themeShade="BF"/>
+          <w:sz w:val="28"/>
+          <w:szCs w:val="28"/>
+        </w:rPr>
+        <w:t xml:space="preserve"> describing what you changed. You can write whatever you want in plain </w:t>
+      </w:r>
+      <w:proofErr w:type="gramStart"/>
+      <w:r>
+        <w:rPr>
+          <w:color w:val="3A7C22" w:themeColor="accent6" w:themeShade="BF"/>
+          <w:sz w:val="28"/>
+          <w:szCs w:val="28"/>
+        </w:rPr>
+        <w:t>English</w:t>
+      </w:r>
+      <w:proofErr w:type="gramEnd"/>
+      <w:r>
+        <w:rPr>
+          <w:color w:val="3A7C22" w:themeColor="accent6" w:themeShade="BF"/>
+          <w:sz w:val="28"/>
+          <w:szCs w:val="28"/>
+        </w:rPr>
+        <w:t xml:space="preserve"> so you know what that commit did when looking back at your project history.</w:t>
+      </w:r>
+    </w:p>
+    <w:p>
+      <w:pPr>
+        <w:spacing w:after="0" w:line="240" w:lineRule="auto"/>
+        <w:rPr>
+          <w:color w:val="3A7C22" w:themeColor="accent6" w:themeShade="BF"/>
+          <w:sz w:val="28"/>
+          <w:szCs w:val="28"/>
+        </w:rPr>
+      </w:pPr>
+      <w:r>
+        <w:rPr>
+          <w:color w:val="3A7C22" w:themeColor="accent6" w:themeShade="BF"/>
+          <w:sz w:val="28"/>
+          <w:szCs w:val="28"/>
+        </w:rPr>
+        <w:t>For this specific push, you can use:</w:t>
+      </w:r>
+    </w:p>
+    <w:p>
+      <w:pPr>
+        <w:spacing w:after="0" w:line="240" w:lineRule="auto"/>
+        <w:rPr>
+          <w:color w:val="3A7C22" w:themeColor="accent6" w:themeShade="BF"/>
+          <w:sz w:val="28"/>
+          <w:szCs w:val="28"/>
+        </w:rPr>
+      </w:pPr>
+    </w:p>
+    <w:p>
+      <w:pPr>
+        <w:spacing w:after="0" w:line="240" w:lineRule="auto"/>
+        <w:rPr>
+          <w:color w:val="3A7C22" w:themeColor="accent6" w:themeShade="BF"/>
+          <w:sz w:val="28"/>
+          <w:szCs w:val="28"/>
+        </w:rPr>
+      </w:pPr>
+      <w:r>
+        <w:rPr>
+          <w:color w:val="3A7C22" w:themeColor="accent6" w:themeShade="BF"/>
+          <w:sz w:val="28"/>
+          <w:szCs w:val="28"/>
+        </w:rPr>
+        <w:t>DOS</w:t>
+      </w:r>
+    </w:p>
+    <w:p>
+      <w:pPr>
+        <w:spacing w:after="0" w:line="240" w:lineRule="auto"/>
+        <w:rPr>
+          <w:color w:val="3A7C22" w:themeColor="accent6" w:themeShade="BF"/>
+          <w:sz w:val="28"/>
+          <w:szCs w:val="28"/>
+        </w:rPr>
+      </w:pPr>
+    </w:p>
+    <w:p>
+      <w:pPr>
+        <w:spacing w:after="0" w:line="240" w:lineRule="auto"/>
+        <w:rPr>
+          <w:color w:val="3A7C22" w:themeColor="accent6" w:themeShade="BF"/>
+          <w:sz w:val="28"/>
+          <w:szCs w:val="28"/>
+        </w:rPr>
+      </w:pPr>
+      <w:r>
+        <w:rPr>
+          <w:color w:val="3A7C22" w:themeColor="accent6" w:themeShade="BF"/>
+          <w:sz w:val="28"/>
+          <w:szCs w:val="28"/>
+        </w:rPr>
+        <w:t>git commit -m "Update index.html with clear setup warnings and verify button"</w:t>
+      </w:r>
+    </w:p>
+    <w:p>
+      <w:pPr>
+        <w:spacing w:after="0" w:line="240" w:lineRule="auto"/>
+        <w:rPr>
+          <w:color w:val="3A7C22" w:themeColor="accent6" w:themeShade="BF"/>
+          <w:sz w:val="28"/>
+          <w:szCs w:val="28"/>
+        </w:rPr>
+      </w:pPr>
+    </w:p>
+    <w:p>
+      <w:pPr>
+        <w:spacing w:after="0" w:line="240" w:lineRule="auto"/>
+        <w:rPr>
+          <w:color w:val="3A7C22" w:themeColor="accent6" w:themeShade="BF"/>
+          <w:sz w:val="28"/>
+          <w:szCs w:val="28"/>
+        </w:rPr>
+      </w:pPr>
+      <w:r>
+        <w:rPr>
+          <w:color w:val="3A7C22" w:themeColor="accent6" w:themeShade="BF"/>
+          <w:sz w:val="28"/>
+          <w:szCs w:val="28"/>
+        </w:rPr>
+        <w:t>git commit -m "Polish logo banner, remove reset anchor button, and implement fully interactive operational modules"</w:t>
+      </w:r>
+    </w:p>
+    <w:p>
+      <w:pPr>
+        <w:spacing w:after="0" w:line="240" w:lineRule="auto"/>
+        <w:rPr>
+          <w:color w:val="3A7C22" w:themeColor="accent6" w:themeShade="BF"/>
+          <w:sz w:val="28"/>
+          <w:szCs w:val="28"/>
+        </w:rPr>
+      </w:pPr>
+    </w:p>
+    <w:p>
+      <w:pPr>
+        <w:spacing w:after="0" w:line="240" w:lineRule="auto"/>
+        <w:rPr>
+          <w:color w:val="3A7C22" w:themeColor="accent6" w:themeShade="BF"/>
+          <w:sz w:val="28"/>
+          <w:szCs w:val="28"/>
+        </w:rPr>
+      </w:pPr>
+      <w:r>
+        <w:rPr>
+          <w:color w:val="3A7C22" w:themeColor="accent6" w:themeShade="BF"/>
+          <w:sz w:val="28"/>
+          <w:szCs w:val="28"/>
+        </w:rPr>
+        <w:t>Then run the final push command:</w:t>
+      </w:r>
+    </w:p>
+    <w:p>
+      <w:pPr>
+        <w:spacing w:after="0" w:line="240" w:lineRule="auto"/>
+        <w:rPr>
+          <w:color w:val="C00000"/>
+          <w:sz w:val="28"/>
+          <w:szCs w:val="28"/>
+        </w:rPr>
+      </w:pPr>
+    </w:p>
+    <w:p>
+      <w:pPr>
+        <w:spacing w:after="0" w:line="240" w:lineRule="auto"/>
+        <w:rPr>
+          <w:color w:val="C00000"/>
+          <w:sz w:val="28"/>
+          <w:szCs w:val="28"/>
+        </w:rPr>
+      </w:pPr>
+      <w:r>
+        <w:rPr>
+          <w:color w:val="C00000"/>
+          <w:sz w:val="28"/>
+          <w:szCs w:val="28"/>
+        </w:rPr>
+        <w:t>git push origin master</w:t>
+      </w:r>
+    </w:p>
+    <w:p>
+      <w:pPr>
         <w:rPr>
           <w:rFonts w:ascii="Comic Sans MS" w:hAnsi="Comic Sans MS"/>
           <w:sz w:val="24"/>
@@ -264,85 +578,8 @@
           <w:sz w:val="24"/>
           <w:szCs w:val="24"/>
         </w:rPr>
-        <w:t>C:\SpookySovereign&gt;git add index.html</w:t>
-      </w:r>
-    </w:p>
-    <w:p>
-      <w:pPr>
-        <w:rPr>
-          <w:rFonts w:ascii="Comic Sans MS" w:hAnsi="Comic Sans MS"/>
-          <w:sz w:val="24"/>
-          <w:szCs w:val="24"/>
-        </w:rPr>
-      </w:pPr>
-      <w:r>
-        <w:rPr>
-          <w:rFonts w:ascii="Comic Sans MS" w:hAnsi="Comic Sans MS"/>
-          <w:sz w:val="24"/>
-          <w:szCs w:val="24"/>
-        </w:rPr>
-        <w:t>C:\SpookySovereign&gt;git commit -m "Update index.html with dynamic single-button client onboarding"</w:t>
-      </w:r>
-    </w:p>
-    <w:p>
-      <w:pPr>
-        <w:rPr>
-          <w:rFonts w:ascii="Comic Sans MS" w:hAnsi="Comic Sans MS"/>
-          <w:sz w:val="24"/>
-          <w:szCs w:val="24"/>
-        </w:rPr>
-      </w:pPr>
-      <w:r>
-        <w:rPr>
-          <w:rFonts w:ascii="Comic Sans MS" w:hAnsi="Comic Sans MS"/>
-          <w:sz w:val="24"/>
-          <w:szCs w:val="24"/>
-        </w:rPr>
-        <w:t>C:\SpookySovereign&gt;git push origin master</w:t>
-      </w:r>
-    </w:p>
-    <w:p>
-      <w:pPr>
-        <w:rPr>
-          <w:rFonts w:ascii="Comic Sans MS" w:hAnsi="Comic Sans MS"/>
-          <w:sz w:val="24"/>
-          <w:szCs w:val="24"/>
-        </w:rPr>
-      </w:pPr>
-    </w:p>
-    <w:p>
-      <w:pPr>
-        <w:rPr>
-          <w:rFonts w:ascii="Comic Sans MS" w:hAnsi="Comic Sans MS"/>
-          <w:sz w:val="24"/>
-          <w:szCs w:val="24"/>
-        </w:rPr>
-      </w:pPr>
-      <w:r>
-        <w:rPr>
-          <w:rFonts w:ascii="Comic Sans MS" w:hAnsi="Comic Sans MS"/>
-          <w:sz w:val="24"/>
-          <w:szCs w:val="24"/>
-        </w:rPr>
-        <w:t xml:space="preserve">Then we </w:t>
-      </w:r>
-      <w:proofErr w:type="gramStart"/>
-      <w:r>
-        <w:rPr>
-          <w:rFonts w:ascii="Comic Sans MS" w:hAnsi="Comic Sans MS"/>
-          <w:sz w:val="24"/>
-          <w:szCs w:val="24"/>
-        </w:rPr>
-        <w:t>restart</w:t>
-      </w:r>
-      <w:proofErr w:type="gramEnd"/>
-      <w:r>
-        <w:rPr>
-          <w:rFonts w:ascii="Comic Sans MS" w:hAnsi="Comic Sans MS"/>
-          <w:sz w:val="24"/>
-          <w:szCs w:val="24"/>
-        </w:rPr>
-        <w:t xml:space="preserve"> our Portal.</w:t>
+        <w:lastRenderedPageBreak/>
+        <w:t>Then we restart our Portal.</w:t>
       </w:r>
     </w:p>
     <w:p>
@@ -523,7 +760,6 @@
           <w:sz w:val="24"/>
           <w:szCs w:val="24"/>
         </w:rPr>
-        <w:lastRenderedPageBreak/>
         <w:t>To wipe your browser memory in 5 seconds:</w:t>
       </w:r>
     </w:p>
@@ -930,6 +1166,7 @@
           <w:sz w:val="24"/>
           <w:szCs w:val="24"/>
         </w:rPr>
+        <w:lastRenderedPageBreak/>
         <w:t>It passes those fixed serial numbers into a cryptographic hash function (SHA-256) along with your transmission salt.</w:t>
       </w:r>
     </w:p>

</xml_diff>